<commit_message>
Document competitor findings overwrite evidence
</commit_message>
<xml_diff>
--- a/09-15_09-17_AI웹서비스설계_MiniProject/ai-mini-project-v0.5/submission/Report-SQAR.docx
+++ b/09-15_09-17_AI웹서비스설계_MiniProject/ai-mini-project-v0.5/submission/Report-SQAR.docx
@@ -1917,7 +1917,7 @@
               <w:spacing w:before="40" w:after="40"/>
             </w:pPr>
             <w:r>
-              <w:t xml:space="preserve">Q1 3개, Q2 3개, Q3 3개(정상 모드 답변에 모두 표시)</w:t>
+              <w:t xml:space="preserve">Q1~Q3 답변에는 3개사가 표시됨. 다만 LangSmith trace(run_id 94beb1fd384f)에서 writer 입력 competitor_findings는 Samsung 1건으로 확인됨. evidence/3-Q2-LangSmith-Trace.png 참고.</w:t>
             </w:r>
           </w:p>
         </w:tc>
@@ -1943,7 +1943,7 @@
               <w:spacing w:before="40" w:after="40"/>
             </w:pPr>
             <w:r>
-              <w:t xml:space="preserve">정상(답변 출력 기준)</w:t>
+              <w:t xml:space="preserve">표시상 3개. 내부 분석 결과 전달은 결함(trace 근거 참조).</w:t>
             </w:r>
           </w:p>
         </w:tc>
@@ -2470,7 +2470,7 @@
               <w:spacing w:before="40" w:after="40"/>
             </w:pPr>
             <w:r>
-              <w:t xml:space="preserve">기업 목록을 순회하며 await analyze_competitor()를 순차 호출함. 답변에는 3개사가 보이나, 코드에서 competitor_findings를 매 반복 [finding]으로 대입해 누적하지 않는 부분도 확인이 필요함.</w:t>
+              <w:t xml:space="preserve">competitor_analyst()가 세 기업을 순회해 분석하지만, nodes.py 90행에서 매 반복마다 competitor_findings를 [finding]으로 덮어씀. 앞선 결과가 사라져 마지막 Samsung만 writer로 전달됨. LangSmith trace에서 LLM 호출 3회와 writer 입력 1건(Samsung)을 확인함.</w:t>
             </w:r>
           </w:p>
         </w:tc>
@@ -3556,7 +3556,7 @@
               <w:spacing w:before="40" w:after="40"/>
             </w:pPr>
             <w:r>
-              <w:t xml:space="preserve">Tavily 웹 검색은 세 정상 모드에서 각 3건으로 작동했으나 검색 정확성과 TRL 판단의 외부 사실 일치 여부는 별도 검증하지 않음. 테스트 모드에서 재시도는 실제 발생하지 않음. 재시도 전용 상한은 없지만 그래프 전체 단계 상한은 기본 25로 설정되어 있고, 초과 시 오류로 중단됨. 실행 시간은 해당 시점 환경 기준임. competitor_findings를 덮어쓰는 코드가 있지만 최종 답변에는 3개사가 표시되어, 각 기업별 분석 근거를 실제 반영했는지는 추가 추적이 필요함.</w:t>
+              <w:t xml:space="preserve">Tavily 검색 결과의 사실 정확성과 TRL 판단은 외부 자료와 별도 대조하지 않음. 테스트 모드에서 재시도는 발생하지 않아 재시도 동작은 코드 기준으로 확인함. LangSmith trace(run_id 94beb1fd384f)에서 competitor_analyst의 LLM 호출 3회 후 writer 입력 competitor_findings가 Samsung 1건뿐임을 확인함. 원인은 backend/app/agent/nodes.py 90행의 결과 덮어쓰기임. 캡처: evidence/3-Q2-LangSmith-Trace.png.</w:t>
             </w:r>
           </w:p>
         </w:tc>
@@ -3619,6 +3619,11 @@
       <w:cols w:space="720"/>
       <w:docGrid w:linePitch="360"/>
     </w:sectPr>
+    <w:p>
+      <w:r>
+        <w:t xml:space="preserve">추가 trace: evidence/3-Q2-LangSmith-Trace.png</w:t>
+      </w:r>
+    </w:p>
   </w:body>
 </w:document>
 </file>

</xml_diff>

<commit_message>
Document source citation traceability risk
</commit_message>
<xml_diff>
--- a/09-15_09-17_AI웹서비스설계_MiniProject/ai-mini-project-v0.5/submission/Report-SQAR.docx
+++ b/09-15_09-17_AI웹서비스설계_MiniProject/ai-mini-project-v0.5/submission/Report-SQAR.docx
@@ -1,8 +1,8 @@
 
 <file path=word/document.xml><?xml version="1.0" encoding="utf-8"?>
-<w:document xmlns:mc="http://schemas.openxmlformats.org/markup-compatibility/2006" xmlns:w14="http://schemas.microsoft.com/office/word/2010/wordml" xmlns:w="http://schemas.openxmlformats.org/wordprocessingml/2006/main" mc:Ignorable="w14 w15 w16se w16cid w16 w16cex w16sdtdh w16sdtfl w16du wp14">
+<w:document xmlns:ns1="http://schemas.openxmlformats.org/markup-compatibility/2006" xmlns:ns2="http://schemas.microsoft.com/office/word/2010/wordml" xmlns:w="http://schemas.openxmlformats.org/wordprocessingml/2006/main" ns1:Ignorable="w14 w15 w16se w16cid w16 w16cex w16sdtdh w16sdtfl w16du wp14">
   <w:body>
-    <w:p>
+    <w:p ns2:paraId="53C1A22F" ns2:textId="31D9488B">
       <w:pPr>
         <w:spacing w:after="60"/>
       </w:pPr>
@@ -17,7 +17,7 @@
         <w:t xml:space="preserve">프로젝트 품질 평가 </w:t>
       </w:r>
     </w:p>
-    <w:p>
+    <w:p ns2:paraId="1E59ECA7" ns2:textId="47C29CED">
       <w:pPr>
         <w:spacing w:before="40" w:after="200"/>
       </w:pPr>
@@ -48,7 +48,7 @@
       <w:tblGrid>
         <w:gridCol w:w="9638"/>
       </w:tblGrid>
-      <w:tr>
+      <w:tr ns2:paraId="4B38C38E" ns2:textId="77777777">
         <w:tc>
           <w:tcPr>
             <w:tcW w:w="9638" w:type="dxa"/>
@@ -67,7 +67,7 @@
             </w:tcMar>
             <w:vAlign w:val="center"/>
           </w:tcPr>
-          <w:p>
+          <w:p ns2:paraId="7AD88D38" ns2:textId="77777777">
             <w:pPr>
               <w:spacing w:before="40" w:after="40"/>
             </w:pPr>
@@ -79,7 +79,7 @@
               <w:t>작성 규칙</w:t>
             </w:r>
           </w:p>
-          <w:p>
+          <w:p ns2:paraId="60AE9347" ns2:textId="2DFC2D97">
             <w:pPr>
               <w:pStyle w:val="ListParagraph"/>
               <w:numPr>
@@ -104,7 +104,7 @@
               <w:t>은 코드를 수정하지 않습니다. 실행하고, 관찰하고, 기록만 합니다.</w:t>
             </w:r>
           </w:p>
-          <w:p>
+          <w:p ns2:paraId="24550740" ns2:textId="77777777">
             <w:pPr>
               <w:pStyle w:val="ListParagraph"/>
               <w:numPr>
@@ -137,7 +137,7 @@
               <w:t xml:space="preserve"> 적습니다. 근거 없는 판정은 인정되지 않습니다.</w:t>
             </w:r>
           </w:p>
-          <w:p>
+          <w:p ns2:paraId="6D03F0C6" ns2:textId="77777777">
             <w:pPr>
               <w:pStyle w:val="ListParagraph"/>
               <w:numPr>
@@ -157,7 +157,7 @@
         </w:tc>
       </w:tr>
     </w:tbl>
-    <w:p>
+    <w:p ns2:paraId="5BB30084" ns2:textId="77777777">
       <w:pPr>
         <w:pStyle w:val="Heading1"/>
         <w:spacing w:before="320" w:after="120"/>
@@ -195,7 +195,7 @@
         <w:gridCol w:w="1300"/>
         <w:gridCol w:w="4038"/>
       </w:tblGrid>
-      <w:tr>
+      <w:tr ns2:paraId="4762B67C" ns2:textId="77777777">
         <w:trPr>
           <w:cantSplit/>
           <w:tblHeader/>
@@ -218,7 +218,7 @@
             </w:tcMar>
             <w:vAlign w:val="center"/>
           </w:tcPr>
-          <w:p>
+          <w:p ns2:paraId="7D27B14D" ns2:textId="77777777">
             <w:pPr>
               <w:spacing w:before="40" w:after="40"/>
             </w:pPr>
@@ -249,7 +249,7 @@
             </w:tcMar>
             <w:vAlign w:val="center"/>
           </w:tcPr>
-          <w:p>
+          <w:p ns2:paraId="76C9BFA5" ns2:textId="77777777">
             <w:pPr>
               <w:spacing w:before="40" w:after="40"/>
             </w:pPr>
@@ -280,7 +280,7 @@
             </w:tcMar>
             <w:vAlign w:val="center"/>
           </w:tcPr>
-          <w:p>
+          <w:p ns2:paraId="34CA13B4" ns2:textId="2EE29963">
             <w:pPr>
               <w:spacing w:before="40" w:after="40"/>
               <w:rPr>
@@ -297,7 +297,7 @@
           </w:p>
         </w:tc>
       </w:tr>
-      <w:tr>
+      <w:tr ns2:paraId="4252056B" ns2:textId="77777777">
         <w:trPr>
           <w:cantSplit/>
           <w:trHeight w:val="620"/>
@@ -319,69 +319,69 @@
             </w:tcMar>
             <w:vAlign w:val="center"/>
           </w:tcPr>
+          <w:p ns2:paraId="30FF8193" ns2:textId="77777777">
+            <w:pPr>
+              <w:spacing w:before="40" w:after="40"/>
+            </w:pPr>
+            <w:r>
+              <w:t>Backend 서버가 정상 실행되는가?</w:t>
+            </w:r>
+          </w:p>
+        </w:tc>
+        <w:tc>
+          <w:tcPr>
+            <w:tcW w:w="1300" w:type="dxa"/>
+            <w:tcBorders>
+              <w:top w:val="single" w:sz="4" w:space="0" w:color="999999"/>
+              <w:left w:val="single" w:sz="4" w:space="0" w:color="999999"/>
+              <w:bottom w:val="single" w:sz="4" w:space="0" w:color="999999"/>
+              <w:right w:val="single" w:sz="4" w:space="0" w:color="999999"/>
+            </w:tcBorders>
+            <w:tcMar>
+              <w:top w:w="60" w:type="dxa"/>
+              <w:left w:w="110" w:type="dxa"/>
+              <w:bottom w:w="60" w:type="dxa"/>
+              <w:right w:w="110" w:type="dxa"/>
+            </w:tcMar>
+            <w:vAlign w:val="center"/>
+          </w:tcPr>
+          <w:p ns2:paraId="551AA5AA" ns2:textId="77777777">
+            <w:pPr>
+              <w:spacing w:before="40" w:after="40"/>
+            </w:pPr>
+            <w:r>
+              <w:t>O</w:t>
+            </w:r>
+          </w:p>
+        </w:tc>
+        <w:tc>
+          <w:tcPr>
+            <w:tcW w:w="4038" w:type="dxa"/>
+            <w:tcBorders>
+              <w:top w:val="single" w:sz="4" w:space="0" w:color="999999"/>
+              <w:left w:val="single" w:sz="4" w:space="0" w:color="999999"/>
+              <w:bottom w:val="single" w:sz="4" w:space="0" w:color="999999"/>
+              <w:right w:val="single" w:sz="4" w:space="0" w:color="999999"/>
+            </w:tcBorders>
+            <w:tcMar>
+              <w:top w:w="60" w:type="dxa"/>
+              <w:left w:w="110" w:type="dxa"/>
+              <w:bottom w:w="60" w:type="dxa"/>
+              <w:right w:w="110" w:type="dxa"/>
+            </w:tcMar>
+            <w:vAlign w:val="center"/>
+          </w:tcPr>
           <w:p>
             <w:pPr>
               <w:spacing w:before="40" w:after="40"/>
             </w:pPr>
             <w:r>
-              <w:t>Backend 서버가 정상 실행되는가?</w:t>
-            </w:r>
-          </w:p>
-        </w:tc>
-        <w:tc>
-          <w:tcPr>
-            <w:tcW w:w="1300" w:type="dxa"/>
-            <w:tcBorders>
-              <w:top w:val="single" w:sz="4" w:space="0" w:color="999999"/>
-              <w:left w:val="single" w:sz="4" w:space="0" w:color="999999"/>
-              <w:bottom w:val="single" w:sz="4" w:space="0" w:color="999999"/>
-              <w:right w:val="single" w:sz="4" w:space="0" w:color="999999"/>
-            </w:tcBorders>
-            <w:tcMar>
-              <w:top w:w="60" w:type="dxa"/>
-              <w:left w:w="110" w:type="dxa"/>
-              <w:bottom w:w="60" w:type="dxa"/>
-              <w:right w:w="110" w:type="dxa"/>
-            </w:tcMar>
-            <w:vAlign w:val="center"/>
-          </w:tcPr>
-          <w:p>
-            <w:pPr>
-              <w:spacing w:before="40" w:after="40"/>
-            </w:pPr>
-            <w:r>
-              <w:t>O</w:t>
-            </w:r>
-          </w:p>
-        </w:tc>
-        <w:tc>
-          <w:tcPr>
-            <w:tcW w:w="4038" w:type="dxa"/>
-            <w:tcBorders>
-              <w:top w:val="single" w:sz="4" w:space="0" w:color="999999"/>
-              <w:left w:val="single" w:sz="4" w:space="0" w:color="999999"/>
-              <w:bottom w:val="single" w:sz="4" w:space="0" w:color="999999"/>
-              <w:right w:val="single" w:sz="4" w:space="0" w:color="999999"/>
-            </w:tcBorders>
-            <w:tcMar>
-              <w:top w:w="60" w:type="dxa"/>
-              <w:left w:w="110" w:type="dxa"/>
-              <w:bottom w:w="60" w:type="dxa"/>
-              <w:right w:w="110" w:type="dxa"/>
-            </w:tcMar>
-            <w:vAlign w:val="center"/>
-          </w:tcPr>
-          <w:p>
-            <w:pPr>
-              <w:spacing w:before="40" w:after="40"/>
-            </w:pPr>
-            <w:r>
               <w:t xml:space="preserve">질문 실행 완료 응답으로 Backend API 연결을 확인함.</w:t>
             </w:r>
           </w:p>
         </w:tc>
       </w:tr>
-      <w:tr>
+      <w:tr ns2:paraId="44EE19D7" ns2:textId="77777777">
         <w:trPr>
           <w:cantSplit/>
           <w:trHeight w:val="620"/>
@@ -403,7 +403,7 @@
             </w:tcMar>
             <w:vAlign w:val="center"/>
           </w:tcPr>
-          <w:p>
+          <w:p ns2:paraId="5FA6A061" ns2:textId="77777777">
             <w:pPr>
               <w:spacing w:before="40" w:after="40"/>
             </w:pPr>
@@ -429,7 +429,7 @@
             </w:tcMar>
             <w:vAlign w:val="center"/>
           </w:tcPr>
-          <w:p>
+          <w:p ns2:paraId="16638028" ns2:textId="77777777">
             <w:pPr>
               <w:spacing w:before="40" w:after="40"/>
             </w:pPr>
@@ -468,7 +468,7 @@
           </w:p>
         </w:tc>
       </w:tr>
-      <w:tr>
+      <w:tr ns2:paraId="3DB9AB7B" ns2:textId="77777777">
         <w:trPr>
           <w:cantSplit/>
           <w:trHeight w:val="620"/>
@@ -490,7 +490,7 @@
             </w:tcMar>
             <w:vAlign w:val="center"/>
           </w:tcPr>
-          <w:p>
+          <w:p ns2:paraId="7D623315" ns2:textId="77777777">
             <w:pPr>
               <w:spacing w:before="40" w:after="40"/>
             </w:pPr>
@@ -516,7 +516,7 @@
             </w:tcMar>
             <w:vAlign w:val="center"/>
           </w:tcPr>
-          <w:p>
+          <w:p ns2:paraId="3B4EA5A4" ns2:textId="77777777">
             <w:pPr>
               <w:spacing w:before="40" w:after="40"/>
             </w:pPr>
@@ -542,7 +542,7 @@
             </w:tcMar>
             <w:vAlign w:val="center"/>
           </w:tcPr>
-          <w:p>
+          <w:p ns2:paraId="5335458A" ns2:textId="77777777">
             <w:pPr>
               <w:spacing w:before="40" w:after="40"/>
             </w:pPr>
@@ -553,12 +553,12 @@
         </w:tc>
       </w:tr>
     </w:tbl>
-    <w:p>
+    <w:p ns2:paraId="6424611D" ns2:textId="77777777">
       <w:pPr>
         <w:spacing w:before="40" w:after="100"/>
       </w:pPr>
     </w:p>
-    <w:p>
+    <w:p ns2:paraId="6298EA10" ns2:textId="77777777">
       <w:pPr>
         <w:rPr>
           <w:b/>
@@ -579,7 +579,7 @@
         <w:br w:type="page"/>
       </w:r>
     </w:p>
-    <w:p>
+    <w:p ns2:paraId="16F45A30" ns2:textId="0C598D93">
       <w:pPr>
         <w:pStyle w:val="Heading1"/>
         <w:spacing w:before="320" w:after="120"/>
@@ -596,7 +596,7 @@
         <w:t>1. 동적 할당 (Supervisor 라우팅)</w:t>
       </w:r>
     </w:p>
-    <w:p>
+    <w:p ns2:paraId="3734A85F" ns2:textId="77777777">
       <w:pPr>
         <w:spacing w:before="40" w:after="100"/>
       </w:pPr>
@@ -626,7 +626,7 @@
         <w:gridCol w:w="4198"/>
         <w:gridCol w:w="4169"/>
       </w:tblGrid>
-      <w:tr>
+      <w:tr ns2:paraId="259FAEB7" ns2:textId="77777777">
         <w:trPr>
           <w:cantSplit/>
           <w:tblHeader/>
@@ -649,7 +649,7 @@
             </w:tcMar>
             <w:vAlign w:val="center"/>
           </w:tcPr>
-          <w:p>
+          <w:p ns2:paraId="7A2C228B" ns2:textId="77777777">
             <w:pPr>
               <w:spacing w:before="40" w:after="40"/>
             </w:pPr>
@@ -680,7 +680,7 @@
             </w:tcMar>
             <w:vAlign w:val="center"/>
           </w:tcPr>
-          <w:p>
+          <w:p ns2:paraId="0A362D21" ns2:textId="77777777">
             <w:pPr>
               <w:spacing w:before="40" w:after="40"/>
             </w:pPr>
@@ -711,7 +711,7 @@
             </w:tcMar>
             <w:vAlign w:val="center"/>
           </w:tcPr>
-          <w:p>
+          <w:p ns2:paraId="5B6DFD6A" ns2:textId="77777777">
             <w:pPr>
               <w:spacing w:before="40" w:after="40"/>
             </w:pPr>
@@ -725,7 +725,7 @@
           </w:p>
         </w:tc>
       </w:tr>
-      <w:tr>
+      <w:tr ns2:paraId="7F5A447B" ns2:textId="77777777">
         <w:trPr>
           <w:cantSplit/>
           <w:trHeight w:val="700"/>
@@ -747,69 +747,69 @@
             </w:tcMar>
             <w:vAlign w:val="center"/>
           </w:tcPr>
+          <w:p ns2:paraId="79FE68D6" ns2:textId="77777777">
+            <w:pPr>
+              <w:spacing w:before="40" w:after="40"/>
+            </w:pPr>
+            <w:r>
+              <w:t>Q1 :</w:t>
+            </w:r>
+          </w:p>
+        </w:tc>
+        <w:tc>
+          <w:tcPr>
+            <w:tcW w:w="4198" w:type="dxa"/>
+            <w:tcBorders>
+              <w:top w:val="single" w:sz="4" w:space="0" w:color="999999"/>
+              <w:left w:val="single" w:sz="4" w:space="0" w:color="999999"/>
+              <w:bottom w:val="single" w:sz="4" w:space="0" w:color="999999"/>
+              <w:right w:val="single" w:sz="4" w:space="0" w:color="999999"/>
+            </w:tcBorders>
+            <w:tcMar>
+              <w:top w:w="60" w:type="dxa"/>
+              <w:left w:w="110" w:type="dxa"/>
+              <w:bottom w:w="60" w:type="dxa"/>
+              <w:right w:w="110" w:type="dxa"/>
+            </w:tcMar>
+            <w:vAlign w:val="center"/>
+          </w:tcPr>
+          <w:p ns2:paraId="3008C916" ns2:textId="77777777">
+            <w:pPr>
+              <w:spacing w:before="40" w:after="40"/>
+            </w:pPr>
+            <w:r>
+              <w:t>Q1: supervisor → researcher → competitor_analyst → writer</w:t>
+            </w:r>
+          </w:p>
+        </w:tc>
+        <w:tc>
+          <w:tcPr>
+            <w:tcW w:w="4169" w:type="dxa"/>
+            <w:tcBorders>
+              <w:top w:val="single" w:sz="4" w:space="0" w:color="999999"/>
+              <w:left w:val="single" w:sz="4" w:space="0" w:color="999999"/>
+              <w:bottom w:val="single" w:sz="4" w:space="0" w:color="999999"/>
+              <w:right w:val="single" w:sz="4" w:space="0" w:color="999999"/>
+            </w:tcBorders>
+            <w:tcMar>
+              <w:top w:w="60" w:type="dxa"/>
+              <w:left w:w="110" w:type="dxa"/>
+              <w:bottom w:w="60" w:type="dxa"/>
+              <w:right w:w="110" w:type="dxa"/>
+            </w:tcMar>
+            <w:vAlign w:val="center"/>
+          </w:tcPr>
           <w:p>
             <w:pPr>
               <w:spacing w:before="40" w:after="40"/>
             </w:pPr>
             <w:r>
-              <w:t>Q1 :</w:t>
-            </w:r>
-          </w:p>
-        </w:tc>
-        <w:tc>
-          <w:tcPr>
-            <w:tcW w:w="4198" w:type="dxa"/>
-            <w:tcBorders>
-              <w:top w:val="single" w:sz="4" w:space="0" w:color="999999"/>
-              <w:left w:val="single" w:sz="4" w:space="0" w:color="999999"/>
-              <w:bottom w:val="single" w:sz="4" w:space="0" w:color="999999"/>
-              <w:right w:val="single" w:sz="4" w:space="0" w:color="999999"/>
-            </w:tcBorders>
-            <w:tcMar>
-              <w:top w:w="60" w:type="dxa"/>
-              <w:left w:w="110" w:type="dxa"/>
-              <w:bottom w:w="60" w:type="dxa"/>
-              <w:right w:w="110" w:type="dxa"/>
-            </w:tcMar>
-            <w:vAlign w:val="center"/>
-          </w:tcPr>
-          <w:p>
-            <w:pPr>
-              <w:spacing w:before="40" w:after="40"/>
-            </w:pPr>
-            <w:r>
-              <w:t>Q1: supervisor → researcher → competitor_analyst → writer</w:t>
-            </w:r>
-          </w:p>
-        </w:tc>
-        <w:tc>
-          <w:tcPr>
-            <w:tcW w:w="4169" w:type="dxa"/>
-            <w:tcBorders>
-              <w:top w:val="single" w:sz="4" w:space="0" w:color="999999"/>
-              <w:left w:val="single" w:sz="4" w:space="0" w:color="999999"/>
-              <w:bottom w:val="single" w:sz="4" w:space="0" w:color="999999"/>
-              <w:right w:val="single" w:sz="4" w:space="0" w:color="999999"/>
-            </w:tcBorders>
-            <w:tcMar>
-              <w:top w:w="60" w:type="dxa"/>
-              <w:left w:w="110" w:type="dxa"/>
-              <w:bottom w:w="60" w:type="dxa"/>
-              <w:right w:w="110" w:type="dxa"/>
-            </w:tcMar>
-            <w:vAlign w:val="center"/>
-          </w:tcPr>
-          <w:p>
-            <w:pPr>
-              <w:spacing w:before="40" w:after="40"/>
-            </w:pPr>
-            <w:r>
               <w:t xml:space="preserve">아니오(각 worker 1회)</w:t>
             </w:r>
           </w:p>
         </w:tc>
       </w:tr>
-      <w:tr>
+      <w:tr ns2:paraId="61887804" ns2:textId="77777777">
         <w:trPr>
           <w:cantSplit/>
           <w:trHeight w:val="700"/>
@@ -831,69 +831,69 @@
             </w:tcMar>
             <w:vAlign w:val="center"/>
           </w:tcPr>
+          <w:p ns2:paraId="45020FB4" ns2:textId="77777777">
+            <w:pPr>
+              <w:spacing w:before="40" w:after="40"/>
+            </w:pPr>
+            <w:r>
+              <w:t>Q2 :</w:t>
+            </w:r>
+          </w:p>
+        </w:tc>
+        <w:tc>
+          <w:tcPr>
+            <w:tcW w:w="4198" w:type="dxa"/>
+            <w:tcBorders>
+              <w:top w:val="single" w:sz="4" w:space="0" w:color="999999"/>
+              <w:left w:val="single" w:sz="4" w:space="0" w:color="999999"/>
+              <w:bottom w:val="single" w:sz="4" w:space="0" w:color="999999"/>
+              <w:right w:val="single" w:sz="4" w:space="0" w:color="999999"/>
+            </w:tcBorders>
+            <w:tcMar>
+              <w:top w:w="60" w:type="dxa"/>
+              <w:left w:w="110" w:type="dxa"/>
+              <w:bottom w:w="60" w:type="dxa"/>
+              <w:right w:w="110" w:type="dxa"/>
+            </w:tcMar>
+            <w:vAlign w:val="center"/>
+          </w:tcPr>
+          <w:p ns2:paraId="7B215151" ns2:textId="77777777">
+            <w:pPr>
+              <w:spacing w:before="40" w:after="40"/>
+            </w:pPr>
+            <w:r>
+              <w:t>Q2: supervisor → researcher → competitor_analyst → writer</w:t>
+            </w:r>
+          </w:p>
+        </w:tc>
+        <w:tc>
+          <w:tcPr>
+            <w:tcW w:w="4169" w:type="dxa"/>
+            <w:tcBorders>
+              <w:top w:val="single" w:sz="4" w:space="0" w:color="999999"/>
+              <w:left w:val="single" w:sz="4" w:space="0" w:color="999999"/>
+              <w:bottom w:val="single" w:sz="4" w:space="0" w:color="999999"/>
+              <w:right w:val="single" w:sz="4" w:space="0" w:color="999999"/>
+            </w:tcBorders>
+            <w:tcMar>
+              <w:top w:w="60" w:type="dxa"/>
+              <w:left w:w="110" w:type="dxa"/>
+              <w:bottom w:w="60" w:type="dxa"/>
+              <w:right w:w="110" w:type="dxa"/>
+            </w:tcMar>
+            <w:vAlign w:val="center"/>
+          </w:tcPr>
           <w:p>
             <w:pPr>
               <w:spacing w:before="40" w:after="40"/>
             </w:pPr>
             <w:r>
-              <w:t>Q2 :</w:t>
-            </w:r>
-          </w:p>
-        </w:tc>
-        <w:tc>
-          <w:tcPr>
-            <w:tcW w:w="4198" w:type="dxa"/>
-            <w:tcBorders>
-              <w:top w:val="single" w:sz="4" w:space="0" w:color="999999"/>
-              <w:left w:val="single" w:sz="4" w:space="0" w:color="999999"/>
-              <w:bottom w:val="single" w:sz="4" w:space="0" w:color="999999"/>
-              <w:right w:val="single" w:sz="4" w:space="0" w:color="999999"/>
-            </w:tcBorders>
-            <w:tcMar>
-              <w:top w:w="60" w:type="dxa"/>
-              <w:left w:w="110" w:type="dxa"/>
-              <w:bottom w:w="60" w:type="dxa"/>
-              <w:right w:w="110" w:type="dxa"/>
-            </w:tcMar>
-            <w:vAlign w:val="center"/>
-          </w:tcPr>
-          <w:p>
-            <w:pPr>
-              <w:spacing w:before="40" w:after="40"/>
-            </w:pPr>
-            <w:r>
-              <w:t>Q2: supervisor → researcher → competitor_analyst → writer</w:t>
-            </w:r>
-          </w:p>
-        </w:tc>
-        <w:tc>
-          <w:tcPr>
-            <w:tcW w:w="4169" w:type="dxa"/>
-            <w:tcBorders>
-              <w:top w:val="single" w:sz="4" w:space="0" w:color="999999"/>
-              <w:left w:val="single" w:sz="4" w:space="0" w:color="999999"/>
-              <w:bottom w:val="single" w:sz="4" w:space="0" w:color="999999"/>
-              <w:right w:val="single" w:sz="4" w:space="0" w:color="999999"/>
-            </w:tcBorders>
-            <w:tcMar>
-              <w:top w:w="60" w:type="dxa"/>
-              <w:left w:w="110" w:type="dxa"/>
-              <w:bottom w:w="60" w:type="dxa"/>
-              <w:right w:w="110" w:type="dxa"/>
-            </w:tcMar>
-            <w:vAlign w:val="center"/>
-          </w:tcPr>
-          <w:p>
-            <w:pPr>
-              <w:spacing w:before="40" w:after="40"/>
-            </w:pPr>
-            <w:r>
               <w:t xml:space="preserve">아니오(각 worker 1회)</w:t>
             </w:r>
           </w:p>
         </w:tc>
       </w:tr>
-      <w:tr>
+      <w:tr ns2:paraId="63C8EADD" ns2:textId="77777777">
         <w:trPr>
           <w:cantSplit/>
           <w:trHeight w:val="700"/>
@@ -915,7 +915,7 @@
             </w:tcMar>
             <w:vAlign w:val="center"/>
           </w:tcPr>
-          <w:p>
+          <w:p ns2:paraId="4B7110C3" ns2:textId="77777777">
             <w:pPr>
               <w:spacing w:before="40" w:after="40"/>
             </w:pPr>
@@ -941,7 +941,7 @@
             </w:tcMar>
             <w:vAlign w:val="center"/>
           </w:tcPr>
-          <w:p>
+          <w:p ns2:paraId="4B9CE47A" ns2:textId="77777777">
             <w:pPr>
               <w:spacing w:before="40" w:after="40"/>
             </w:pPr>
@@ -978,7 +978,7 @@
         </w:tc>
       </w:tr>
     </w:tbl>
-    <w:p>
+    <w:p ns2:paraId="7628A8E4" ns2:textId="77777777">
       <w:pPr>
         <w:spacing w:after="80"/>
       </w:pPr>
@@ -1005,7 +1005,7 @@
         <w:gridCol w:w="1500"/>
         <w:gridCol w:w="3838"/>
       </w:tblGrid>
-      <w:tr>
+      <w:tr ns2:paraId="363AADD6" ns2:textId="77777777">
         <w:trPr>
           <w:cantSplit/>
           <w:tblHeader/>
@@ -1028,7 +1028,7 @@
             </w:tcMar>
             <w:vAlign w:val="center"/>
           </w:tcPr>
-          <w:p>
+          <w:p ns2:paraId="1671919C" ns2:textId="77777777">
             <w:pPr>
               <w:spacing w:before="40" w:after="40"/>
             </w:pPr>
@@ -1059,7 +1059,7 @@
             </w:tcMar>
             <w:vAlign w:val="center"/>
           </w:tcPr>
-          <w:p>
+          <w:p ns2:paraId="1DEBDDD9" ns2:textId="77777777">
             <w:pPr>
               <w:spacing w:before="40" w:after="40"/>
             </w:pPr>
@@ -1090,7 +1090,7 @@
             </w:tcMar>
             <w:vAlign w:val="center"/>
           </w:tcPr>
-          <w:p>
+          <w:p ns2:paraId="7CAA8EF1" ns2:textId="77777777">
             <w:pPr>
               <w:spacing w:before="40" w:after="40"/>
             </w:pPr>
@@ -1104,7 +1104,7 @@
           </w:p>
         </w:tc>
       </w:tr>
-      <w:tr>
+      <w:tr ns2:paraId="6991401D" ns2:textId="77777777">
         <w:trPr>
           <w:cantSplit/>
           <w:trHeight w:val="800"/>
@@ -1126,7 +1126,7 @@
             </w:tcMar>
             <w:vAlign w:val="center"/>
           </w:tcPr>
-          <w:p>
+          <w:p ns2:paraId="042BAF01" ns2:textId="77777777">
             <w:pPr>
               <w:spacing w:before="40" w:after="40"/>
             </w:pPr>
@@ -1152,7 +1152,7 @@
             </w:tcMar>
             <w:vAlign w:val="center"/>
           </w:tcPr>
-          <w:p>
+          <w:p ns2:paraId="1AE57F0D" ns2:textId="77777777">
             <w:pPr>
               <w:spacing w:before="40" w:after="40"/>
             </w:pPr>
@@ -1178,7 +1178,7 @@
             </w:tcMar>
             <w:vAlign w:val="center"/>
           </w:tcPr>
-          <w:p>
+          <w:p ns2:paraId="7147C659" ns2:textId="77777777">
             <w:pPr>
               <w:spacing w:before="40" w:after="40"/>
             </w:pPr>
@@ -1188,7 +1188,7 @@
           </w:p>
         </w:tc>
       </w:tr>
-      <w:tr>
+      <w:tr ns2:paraId="690EBEC6" ns2:textId="77777777">
         <w:trPr>
           <w:cantSplit/>
           <w:trHeight w:val="800"/>
@@ -1210,7 +1210,7 @@
             </w:tcMar>
             <w:vAlign w:val="center"/>
           </w:tcPr>
-          <w:p>
+          <w:p ns2:paraId="04557513" ns2:textId="77777777">
             <w:pPr>
               <w:spacing w:before="40" w:after="40"/>
             </w:pPr>
@@ -1236,7 +1236,7 @@
             </w:tcMar>
             <w:vAlign w:val="center"/>
           </w:tcPr>
-          <w:p>
+          <w:p ns2:paraId="5D7919E4" ns2:textId="77777777">
             <w:pPr>
               <w:spacing w:before="40" w:after="40"/>
             </w:pPr>
@@ -1262,7 +1262,7 @@
             </w:tcMar>
             <w:vAlign w:val="center"/>
           </w:tcPr>
-          <w:p>
+          <w:p ns2:paraId="09E31E51" ns2:textId="77777777">
             <w:pPr>
               <w:spacing w:before="40" w:after="40"/>
             </w:pPr>
@@ -1272,7 +1272,7 @@
           </w:p>
         </w:tc>
       </w:tr>
-      <w:tr>
+      <w:tr ns2:paraId="31728097" ns2:textId="77777777">
         <w:trPr>
           <w:cantSplit/>
           <w:trHeight w:val="800"/>
@@ -1294,7 +1294,7 @@
             </w:tcMar>
             <w:vAlign w:val="center"/>
           </w:tcPr>
-          <w:p>
+          <w:p ns2:paraId="75B9985B" ns2:textId="77777777">
             <w:pPr>
               <w:spacing w:before="40" w:after="40"/>
             </w:pPr>
@@ -1320,7 +1320,7 @@
             </w:tcMar>
             <w:vAlign w:val="center"/>
           </w:tcPr>
-          <w:p>
+          <w:p ns2:paraId="6C16C082" ns2:textId="77777777">
             <w:pPr>
               <w:spacing w:before="40" w:after="40"/>
             </w:pPr>
@@ -1346,7 +1346,7 @@
             </w:tcMar>
             <w:vAlign w:val="center"/>
           </w:tcPr>
-          <w:p>
+          <w:p ns2:paraId="3FE4392E" ns2:textId="77777777">
             <w:pPr>
               <w:spacing w:before="40" w:after="40"/>
             </w:pPr>
@@ -1357,7 +1357,7 @@
         </w:tc>
       </w:tr>
     </w:tbl>
-    <w:p>
+    <w:p ns2:paraId="10BBE365" ns2:textId="77777777">
       <w:pPr>
         <w:spacing w:after="80"/>
       </w:pPr>
@@ -1383,7 +1383,7 @@
         <w:gridCol w:w="2200"/>
         <w:gridCol w:w="7438"/>
       </w:tblGrid>
-      <w:tr>
+      <w:tr ns2:paraId="7CB4C203" ns2:textId="77777777">
         <w:trPr>
           <w:cantSplit/>
           <w:trHeight w:val="900"/>
@@ -1406,7 +1406,7 @@
             </w:tcMar>
             <w:vAlign w:val="center"/>
           </w:tcPr>
-          <w:p>
+          <w:p ns2:paraId="130F588F" ns2:textId="77777777">
             <w:pPr>
               <w:spacing w:before="40" w:after="40"/>
             </w:pPr>
@@ -1432,7 +1432,7 @@
             </w:tcMar>
             <w:vAlign w:val="center"/>
           </w:tcPr>
-          <w:p>
+          <w:p ns2:paraId="4EC528A3" ns2:textId="77777777">
             <w:pPr>
               <w:spacing w:before="40" w:after="40"/>
             </w:pPr>
@@ -1442,7 +1442,7 @@
           </w:p>
         </w:tc>
       </w:tr>
-      <w:tr>
+      <w:tr ns2:paraId="1A23B398" ns2:textId="77777777">
         <w:trPr>
           <w:cantSplit/>
           <w:trHeight w:val="900"/>
@@ -1465,7 +1465,7 @@
             </w:tcMar>
             <w:vAlign w:val="center"/>
           </w:tcPr>
-          <w:p>
+          <w:p ns2:paraId="3D83F443" ns2:textId="77777777">
             <w:pPr>
               <w:spacing w:before="40" w:after="40"/>
             </w:pPr>
@@ -1502,12 +1502,12 @@
         </w:tc>
       </w:tr>
     </w:tbl>
-    <w:p>
+    <w:p ns2:paraId="3A9A4EE0" ns2:textId="77777777">
       <w:pPr>
         <w:spacing w:before="40" w:after="100"/>
       </w:pPr>
     </w:p>
-    <w:p>
+    <w:p ns2:paraId="4830F56C" ns2:textId="373D029F">
       <w:pPr>
         <w:spacing w:before="40" w:after="100"/>
       </w:pPr>
@@ -1516,6 +1516,56 @@
           <w:rFonts w:hint="eastAsia"/>
         </w:rPr>
         <w:t xml:space="preserve">제출 자료 : </w:t>
+      </w:r>
+    </w:p>
+    <w:p ns2:paraId="19440774" ns2:textId="77777777">
+      <w:pPr>
+        <w:pStyle w:val="ListParagraph"/>
+        <w:numPr>
+          <w:ilvl w:val="0"/>
+          <w:numId w:val="3"/>
+        </w:numPr>
+        <w:spacing w:before="40" w:after="100"/>
+      </w:pPr>
+      <w:r>
+        <w:rPr>
+          <w:rFonts w:hint="eastAsia"/>
+        </w:rPr>
+        <w:t>질문별 오른쪽 패널 캡쳐 (실행 경로, 시간, 평가 판정의 근거)</w:t>
+      </w:r>
+    </w:p>
+    <w:p ns2:paraId="61DEB119" ns2:textId="29FED9A6">
+      <w:pPr>
+        <w:pStyle w:val="ListParagraph"/>
+        <w:numPr>
+          <w:ilvl w:val="0"/>
+          <w:numId w:val="3"/>
+        </w:numPr>
+        <w:spacing w:before="40" w:after="100"/>
+      </w:pPr>
+      <w:r>
+        <w:rPr>
+          <w:rFonts w:hint="eastAsia"/>
+        </w:rPr>
+        <w:t xml:space="preserve">파일명 : </w:t>
+      </w:r>
+      <w:r>
+        <w:rPr>
+          <w:rFonts w:hint="eastAsia"/>
+        </w:rPr>
+        <w:t>1</w:t>
+      </w:r>
+      <w:r>
+        <w:rPr>
+          <w:rFonts w:hint="eastAsia"/>
+        </w:rPr>
+        <w:t>-</w:t>
+      </w:r>
+      <w:r>
+        <w:rPr>
+          <w:lang w:val="en-US"/>
+        </w:rPr>
+        <w:t xml:space="preserve">Q1.png </w:t>
       </w:r>
     </w:p>
     <w:p>
@@ -1530,56 +1580,6 @@
       <w:r>
         <w:rPr>
           <w:rFonts w:hint="eastAsia"/>
-        </w:rPr>
-        <w:t>질문별 오른쪽 패널 캡쳐 (실행 경로, 시간, 평가 판정의 근거)</w:t>
-      </w:r>
-    </w:p>
-    <w:p>
-      <w:pPr>
-        <w:pStyle w:val="ListParagraph"/>
-        <w:numPr>
-          <w:ilvl w:val="0"/>
-          <w:numId w:val="3"/>
-        </w:numPr>
-        <w:spacing w:before="40" w:after="100"/>
-      </w:pPr>
-      <w:r>
-        <w:rPr>
-          <w:rFonts w:hint="eastAsia"/>
-        </w:rPr>
-        <w:t xml:space="preserve">파일명 : </w:t>
-      </w:r>
-      <w:r>
-        <w:rPr>
-          <w:rFonts w:hint="eastAsia"/>
-        </w:rPr>
-        <w:t>1</w:t>
-      </w:r>
-      <w:r>
-        <w:rPr>
-          <w:rFonts w:hint="eastAsia"/>
-        </w:rPr>
-        <w:t>-</w:t>
-      </w:r>
-      <w:r>
-        <w:rPr>
-          <w:lang w:val="en-US"/>
-        </w:rPr>
-        <w:t xml:space="preserve">Q1.png </w:t>
-      </w:r>
-    </w:p>
-    <w:p>
-      <w:pPr>
-        <w:pStyle w:val="ListParagraph"/>
-        <w:numPr>
-          <w:ilvl w:val="0"/>
-          <w:numId w:val="3"/>
-        </w:numPr>
-        <w:spacing w:before="40" w:after="100"/>
-      </w:pPr>
-      <w:r>
-        <w:rPr>
-          <w:rFonts w:hint="eastAsia"/>
           <w:lang w:val="en-US"/>
         </w:rPr>
         <w:t xml:space="preserve">패널 외 코드, 로그</w:t>
@@ -1634,7 +1634,7 @@
         <w:br w:type="page"/>
       </w:r>
     </w:p>
-    <w:p>
+    <w:p ns2:paraId="66AD98EC" ns2:textId="4A433372">
       <w:pPr>
         <w:pStyle w:val="Heading1"/>
         <w:spacing w:before="320" w:after="120"/>
@@ -1673,7 +1673,7 @@
         <w:gridCol w:w="3838"/>
         <w:gridCol w:w="1500"/>
       </w:tblGrid>
-      <w:tr>
+      <w:tr ns2:paraId="092E9B69" ns2:textId="77777777">
         <w:trPr>
           <w:cantSplit/>
           <w:tblHeader/>
@@ -1696,7 +1696,7 @@
             </w:tcMar>
             <w:vAlign w:val="center"/>
           </w:tcPr>
-          <w:p>
+          <w:p ns2:paraId="2CD0733F" ns2:textId="77777777">
             <w:pPr>
               <w:spacing w:before="40" w:after="40"/>
             </w:pPr>
@@ -1727,7 +1727,7 @@
             </w:tcMar>
             <w:vAlign w:val="center"/>
           </w:tcPr>
-          <w:p>
+          <w:p ns2:paraId="53E205BC" ns2:textId="77777777">
             <w:pPr>
               <w:spacing w:before="40" w:after="40"/>
             </w:pPr>
@@ -1758,7 +1758,7 @@
             </w:tcMar>
             <w:vAlign w:val="center"/>
           </w:tcPr>
-          <w:p>
+          <w:p ns2:paraId="2102F2F0" ns2:textId="77777777">
             <w:pPr>
               <w:spacing w:before="40" w:after="40"/>
             </w:pPr>
@@ -1772,7 +1772,7 @@
           </w:p>
         </w:tc>
       </w:tr>
-      <w:tr>
+      <w:tr ns2:paraId="0BF7CAB3" ns2:textId="77777777">
         <w:trPr>
           <w:cantSplit/>
           <w:trHeight w:val="700"/>
@@ -1794,69 +1794,69 @@
             </w:tcMar>
             <w:vAlign w:val="center"/>
           </w:tcPr>
+          <w:p ns2:paraId="5C0CC3CA" ns2:textId="77777777">
+            <w:pPr>
+              <w:spacing w:before="40" w:after="40"/>
+            </w:pPr>
+            <w:r>
+              <w:t>2-1. 설정한 경쟁사 수</w:t>
+            </w:r>
+          </w:p>
+        </w:tc>
+        <w:tc>
+          <w:tcPr>
+            <w:tcW w:w="3838" w:type="dxa"/>
+            <w:tcBorders>
+              <w:top w:val="single" w:sz="4" w:space="0" w:color="999999"/>
+              <w:left w:val="single" w:sz="4" w:space="0" w:color="999999"/>
+              <w:bottom w:val="single" w:sz="4" w:space="0" w:color="999999"/>
+              <w:right w:val="single" w:sz="4" w:space="0" w:color="999999"/>
+            </w:tcBorders>
+            <w:tcMar>
+              <w:top w:w="60" w:type="dxa"/>
+              <w:left w:w="110" w:type="dxa"/>
+              <w:bottom w:w="60" w:type="dxa"/>
+              <w:right w:w="110" w:type="dxa"/>
+            </w:tcMar>
+            <w:vAlign w:val="center"/>
+          </w:tcPr>
+          <w:p ns2:paraId="70C00282" ns2:textId="77777777">
+            <w:pPr>
+              <w:spacing w:before="40" w:after="40"/>
+            </w:pPr>
+            <w:r>
+              <w:t>3개 (SK hynix, SanDisk, Samsung)</w:t>
+            </w:r>
+          </w:p>
+        </w:tc>
+        <w:tc>
+          <w:tcPr>
+            <w:tcW w:w="1500" w:type="dxa"/>
+            <w:tcBorders>
+              <w:top w:val="single" w:sz="4" w:space="0" w:color="999999"/>
+              <w:left w:val="single" w:sz="4" w:space="0" w:color="999999"/>
+              <w:bottom w:val="single" w:sz="4" w:space="0" w:color="999999"/>
+              <w:right w:val="single" w:sz="4" w:space="0" w:color="999999"/>
+            </w:tcBorders>
+            <w:tcMar>
+              <w:top w:w="60" w:type="dxa"/>
+              <w:left w:w="110" w:type="dxa"/>
+              <w:bottom w:w="60" w:type="dxa"/>
+              <w:right w:w="110" w:type="dxa"/>
+            </w:tcMar>
+            <w:vAlign w:val="center"/>
+          </w:tcPr>
           <w:p>
             <w:pPr>
               <w:spacing w:before="40" w:after="40"/>
             </w:pPr>
             <w:r>
-              <w:t>2-1. 설정한 경쟁사 수</w:t>
-            </w:r>
-          </w:p>
-        </w:tc>
-        <w:tc>
-          <w:tcPr>
-            <w:tcW w:w="3838" w:type="dxa"/>
-            <w:tcBorders>
-              <w:top w:val="single" w:sz="4" w:space="0" w:color="999999"/>
-              <w:left w:val="single" w:sz="4" w:space="0" w:color="999999"/>
-              <w:bottom w:val="single" w:sz="4" w:space="0" w:color="999999"/>
-              <w:right w:val="single" w:sz="4" w:space="0" w:color="999999"/>
-            </w:tcBorders>
-            <w:tcMar>
-              <w:top w:w="60" w:type="dxa"/>
-              <w:left w:w="110" w:type="dxa"/>
-              <w:bottom w:w="60" w:type="dxa"/>
-              <w:right w:w="110" w:type="dxa"/>
-            </w:tcMar>
-            <w:vAlign w:val="center"/>
-          </w:tcPr>
-          <w:p>
-            <w:pPr>
-              <w:spacing w:before="40" w:after="40"/>
-            </w:pPr>
-            <w:r>
-              <w:t>3개 (SK hynix, SanDisk, Samsung)</w:t>
-            </w:r>
-          </w:p>
-        </w:tc>
-        <w:tc>
-          <w:tcPr>
-            <w:tcW w:w="1500" w:type="dxa"/>
-            <w:tcBorders>
-              <w:top w:val="single" w:sz="4" w:space="0" w:color="999999"/>
-              <w:left w:val="single" w:sz="4" w:space="0" w:color="999999"/>
-              <w:bottom w:val="single" w:sz="4" w:space="0" w:color="999999"/>
-              <w:right w:val="single" w:sz="4" w:space="0" w:color="999999"/>
-            </w:tcBorders>
-            <w:tcMar>
-              <w:top w:w="60" w:type="dxa"/>
-              <w:left w:w="110" w:type="dxa"/>
-              <w:bottom w:w="60" w:type="dxa"/>
-              <w:right w:w="110" w:type="dxa"/>
-            </w:tcMar>
-            <w:vAlign w:val="center"/>
-          </w:tcPr>
-          <w:p>
-            <w:pPr>
-              <w:spacing w:before="40" w:after="40"/>
-            </w:pPr>
-            <w:r>
               <w:t xml:space="preserve">정상(설정 3개와 일치)</w:t>
             </w:r>
           </w:p>
         </w:tc>
       </w:tr>
-      <w:tr>
+      <w:tr ns2:paraId="57887D24" ns2:textId="77777777">
         <w:trPr>
           <w:cantSplit/>
           <w:trHeight w:val="700"/>
@@ -1878,26 +1878,52 @@
             </w:tcMar>
             <w:vAlign w:val="center"/>
           </w:tcPr>
+          <w:p ns2:paraId="3C27F3F8" ns2:textId="77777777">
+            <w:pPr>
+              <w:spacing w:before="40" w:after="40"/>
+            </w:pPr>
+            <w:r>
+              <w:t>2-2. 결과(답변)</w:t>
+            </w:r>
+            <w:proofErr w:type="spellStart"/>
+            <w:r>
+              <w:t>에</w:t>
+            </w:r>
+            <w:proofErr w:type="spellEnd"/>
+            <w:r>
+              <w:t xml:space="preserve"> 나타난 경쟁사 수</w:t>
+            </w:r>
+          </w:p>
+        </w:tc>
+        <w:tc>
+          <w:tcPr>
+            <w:tcW w:w="3838" w:type="dxa"/>
+            <w:tcBorders>
+              <w:top w:val="single" w:sz="4" w:space="0" w:color="999999"/>
+              <w:left w:val="single" w:sz="4" w:space="0" w:color="999999"/>
+              <w:bottom w:val="single" w:sz="4" w:space="0" w:color="999999"/>
+              <w:right w:val="single" w:sz="4" w:space="0" w:color="999999"/>
+            </w:tcBorders>
+            <w:tcMar>
+              <w:top w:w="60" w:type="dxa"/>
+              <w:left w:w="110" w:type="dxa"/>
+              <w:bottom w:w="60" w:type="dxa"/>
+              <w:right w:w="110" w:type="dxa"/>
+            </w:tcMar>
+            <w:vAlign w:val="center"/>
+          </w:tcPr>
           <w:p>
             <w:pPr>
               <w:spacing w:before="40" w:after="40"/>
             </w:pPr>
             <w:r>
-              <w:t>2-2. 결과(답변)</w:t>
-            </w:r>
-            <w:proofErr w:type="spellStart"/>
-            <w:r>
-              <w:t>에</w:t>
-            </w:r>
-            <w:proofErr w:type="spellEnd"/>
-            <w:r>
-              <w:t xml:space="preserve"> 나타난 경쟁사 수</w:t>
-            </w:r>
-          </w:p>
-        </w:tc>
-        <w:tc>
-          <w:tcPr>
-            <w:tcW w:w="3838" w:type="dxa"/>
+              <w:t xml:space="preserve">Q1~Q3 답변에는 3개사가 표시됨. 다만 LangSmith trace(run_id 94beb1fd384f)에서 writer 입력 competitor_findings는 Samsung 1건으로 확인됨. evidence/3-Q2-LangSmith-Trace.png 참고.</w:t>
+            </w:r>
+          </w:p>
+        </w:tc>
+        <w:tc>
+          <w:tcPr>
+            <w:tcW w:w="1500" w:type="dxa"/>
             <w:tcBorders>
               <w:top w:val="single" w:sz="4" w:space="0" w:color="999999"/>
               <w:left w:val="single" w:sz="4" w:space="0" w:color="999999"/>
@@ -1917,38 +1943,12 @@
               <w:spacing w:before="40" w:after="40"/>
             </w:pPr>
             <w:r>
-              <w:t xml:space="preserve">Q1~Q3 답변에는 3개사가 표시됨. 다만 LangSmith trace(run_id 94beb1fd384f)에서 writer 입력 competitor_findings는 Samsung 1건으로 확인됨. evidence/3-Q2-LangSmith-Trace.png 참고.</w:t>
-            </w:r>
-          </w:p>
-        </w:tc>
-        <w:tc>
-          <w:tcPr>
-            <w:tcW w:w="1500" w:type="dxa"/>
-            <w:tcBorders>
-              <w:top w:val="single" w:sz="4" w:space="0" w:color="999999"/>
-              <w:left w:val="single" w:sz="4" w:space="0" w:color="999999"/>
-              <w:bottom w:val="single" w:sz="4" w:space="0" w:color="999999"/>
-              <w:right w:val="single" w:sz="4" w:space="0" w:color="999999"/>
-            </w:tcBorders>
-            <w:tcMar>
-              <w:top w:w="60" w:type="dxa"/>
-              <w:left w:w="110" w:type="dxa"/>
-              <w:bottom w:w="60" w:type="dxa"/>
-              <w:right w:w="110" w:type="dxa"/>
-            </w:tcMar>
-            <w:vAlign w:val="center"/>
-          </w:tcPr>
-          <w:p>
-            <w:pPr>
-              <w:spacing w:before="40" w:after="40"/>
-            </w:pPr>
-            <w:r>
               <w:t xml:space="preserve">표시상 3개. 내부 분석 결과 전달은 결함(trace 근거 참조).</w:t>
             </w:r>
           </w:p>
         </w:tc>
       </w:tr>
-      <w:tr>
+      <w:tr ns2:paraId="7BFC5532" ns2:textId="77777777">
         <w:trPr>
           <w:cantSplit/>
           <w:trHeight w:val="700"/>
@@ -1970,7 +1970,7 @@
             </w:tcMar>
             <w:vAlign w:val="center"/>
           </w:tcPr>
-          <w:p>
+          <w:p ns2:paraId="2A35BE8C" ns2:textId="77777777">
             <w:pPr>
               <w:spacing w:before="40" w:after="40"/>
             </w:pPr>
@@ -1996,7 +1996,7 @@
             </w:tcMar>
             <w:vAlign w:val="center"/>
           </w:tcPr>
-          <w:p>
+          <w:p ns2:paraId="6ADBCCFC" ns2:textId="77777777">
             <w:pPr>
               <w:spacing w:before="40" w:after="40"/>
             </w:pPr>
@@ -2034,7 +2034,7 @@
             </w:tcMar>
             <w:vAlign w:val="center"/>
           </w:tcPr>
-          <w:p>
+          <w:p ns2:paraId="7952E3DC" ns2:textId="77777777">
             <w:pPr>
               <w:spacing w:before="40" w:after="40"/>
             </w:pPr>
@@ -2044,7 +2044,7 @@
           </w:p>
         </w:tc>
       </w:tr>
-      <w:tr>
+      <w:tr ns2:paraId="5A508C3E" ns2:textId="77777777">
         <w:trPr>
           <w:cantSplit/>
           <w:trHeight w:val="700"/>
@@ -2066,81 +2066,81 @@
             </w:tcMar>
             <w:vAlign w:val="center"/>
           </w:tcPr>
+          <w:p ns2:paraId="1A5D5D1F" ns2:textId="77777777">
+            <w:pPr>
+              <w:spacing w:before="40" w:after="40"/>
+            </w:pPr>
+            <w:r>
+              <w:t>2-4. Fan-out 구간 전체 소요 시간</w:t>
+            </w:r>
+          </w:p>
+        </w:tc>
+        <w:tc>
+          <w:tcPr>
+            <w:tcW w:w="3838" w:type="dxa"/>
+            <w:tcBorders>
+              <w:top w:val="single" w:sz="4" w:space="0" w:color="999999"/>
+              <w:left w:val="single" w:sz="4" w:space="0" w:color="999999"/>
+              <w:bottom w:val="single" w:sz="4" w:space="0" w:color="999999"/>
+              <w:right w:val="single" w:sz="4" w:space="0" w:color="999999"/>
+            </w:tcBorders>
+            <w:tcMar>
+              <w:top w:w="60" w:type="dxa"/>
+              <w:left w:w="110" w:type="dxa"/>
+              <w:bottom w:w="60" w:type="dxa"/>
+              <w:right w:w="110" w:type="dxa"/>
+            </w:tcMar>
+            <w:vAlign w:val="center"/>
+          </w:tcPr>
+          <w:p ns2:paraId="0ACA2EC7" ns2:textId="77777777">
+            <w:pPr>
+              <w:spacing w:before="40" w:after="40"/>
+            </w:pPr>
+            <w:r>
+              <w:t>Q1 10.491초</w:t>
+            </w:r>
+            <w:r>
+              <w:br/>
+            </w:r>
+            <w:r>
+              <w:t>Q2 10.114초</w:t>
+            </w:r>
+            <w:r>
+              <w:br/>
+            </w:r>
+            <w:r>
+              <w:t>Q3 10.213초</w:t>
+            </w:r>
+          </w:p>
+        </w:tc>
+        <w:tc>
+          <w:tcPr>
+            <w:tcW w:w="1500" w:type="dxa"/>
+            <w:tcBorders>
+              <w:top w:val="single" w:sz="4" w:space="0" w:color="999999"/>
+              <w:left w:val="single" w:sz="4" w:space="0" w:color="999999"/>
+              <w:bottom w:val="single" w:sz="4" w:space="0" w:color="999999"/>
+              <w:right w:val="single" w:sz="4" w:space="0" w:color="999999"/>
+            </w:tcBorders>
+            <w:tcMar>
+              <w:top w:w="60" w:type="dxa"/>
+              <w:left w:w="110" w:type="dxa"/>
+              <w:bottom w:w="60" w:type="dxa"/>
+              <w:right w:w="110" w:type="dxa"/>
+            </w:tcMar>
+            <w:vAlign w:val="center"/>
+          </w:tcPr>
           <w:p>
             <w:pPr>
               <w:spacing w:before="40" w:after="40"/>
             </w:pPr>
             <w:r>
-              <w:t>2-4. Fan-out 구간 전체 소요 시간</w:t>
-            </w:r>
-          </w:p>
-        </w:tc>
-        <w:tc>
-          <w:tcPr>
-            <w:tcW w:w="3838" w:type="dxa"/>
-            <w:tcBorders>
-              <w:top w:val="single" w:sz="4" w:space="0" w:color="999999"/>
-              <w:left w:val="single" w:sz="4" w:space="0" w:color="999999"/>
-              <w:bottom w:val="single" w:sz="4" w:space="0" w:color="999999"/>
-              <w:right w:val="single" w:sz="4" w:space="0" w:color="999999"/>
-            </w:tcBorders>
-            <w:tcMar>
-              <w:top w:w="60" w:type="dxa"/>
-              <w:left w:w="110" w:type="dxa"/>
-              <w:bottom w:w="60" w:type="dxa"/>
-              <w:right w:w="110" w:type="dxa"/>
-            </w:tcMar>
-            <w:vAlign w:val="center"/>
-          </w:tcPr>
-          <w:p>
-            <w:pPr>
-              <w:spacing w:before="40" w:after="40"/>
-            </w:pPr>
-            <w:r>
-              <w:t>Q1 10.491초</w:t>
-            </w:r>
-            <w:r>
-              <w:br/>
-            </w:r>
-            <w:r>
-              <w:t>Q2 10.114초</w:t>
-            </w:r>
-            <w:r>
-              <w:br/>
-            </w:r>
-            <w:r>
-              <w:t>Q3 10.213초</w:t>
-            </w:r>
-          </w:p>
-        </w:tc>
-        <w:tc>
-          <w:tcPr>
-            <w:tcW w:w="1500" w:type="dxa"/>
-            <w:tcBorders>
-              <w:top w:val="single" w:sz="4" w:space="0" w:color="999999"/>
-              <w:left w:val="single" w:sz="4" w:space="0" w:color="999999"/>
-              <w:bottom w:val="single" w:sz="4" w:space="0" w:color="999999"/>
-              <w:right w:val="single" w:sz="4" w:space="0" w:color="999999"/>
-            </w:tcBorders>
-            <w:tcMar>
-              <w:top w:w="60" w:type="dxa"/>
-              <w:left w:w="110" w:type="dxa"/>
-              <w:bottom w:w="60" w:type="dxa"/>
-              <w:right w:w="110" w:type="dxa"/>
-            </w:tcMar>
-            <w:vAlign w:val="center"/>
-          </w:tcPr>
-          <w:p>
-            <w:pPr>
-              <w:spacing w:before="40" w:after="40"/>
-            </w:pPr>
-            <w:r>
               <w:t xml:space="preserve">정상</w:t>
             </w:r>
           </w:p>
         </w:tc>
       </w:tr>
-      <w:tr>
+      <w:tr ns2:paraId="40457E94" ns2:textId="77777777">
         <w:trPr>
           <w:cantSplit/>
           <w:trHeight w:val="700"/>
@@ -2162,7 +2162,7 @@
             </w:tcMar>
             <w:vAlign w:val="center"/>
           </w:tcPr>
-          <w:p>
+          <w:p ns2:paraId="5F210F92" ns2:textId="77777777">
             <w:pPr>
               <w:spacing w:before="40" w:after="40"/>
             </w:pPr>
@@ -2204,7 +2204,7 @@
             </w:tcMar>
             <w:vAlign w:val="center"/>
           </w:tcPr>
-          <w:p>
+          <w:p ns2:paraId="125F4735" ns2:textId="77777777">
             <w:pPr>
               <w:spacing w:before="40" w:after="40"/>
             </w:pPr>
@@ -2230,7 +2230,7 @@
             </w:tcMar>
             <w:vAlign w:val="center"/>
           </w:tcPr>
-          <w:p>
+          <w:p ns2:paraId="6C3B76B2" ns2:textId="77777777">
             <w:pPr>
               <w:spacing w:before="40" w:after="40"/>
             </w:pPr>
@@ -2240,7 +2240,7 @@
           </w:p>
         </w:tc>
       </w:tr>
-      <w:tr>
+      <w:tr ns2:paraId="72FC57B3" ns2:textId="77777777">
         <w:trPr>
           <w:cantSplit/>
           <w:trHeight w:val="700"/>
@@ -2262,7 +2262,7 @@
             </w:tcMar>
             <w:vAlign w:val="center"/>
           </w:tcPr>
-          <w:p>
+          <w:p ns2:paraId="4515CD9B" ns2:textId="4391C998">
             <w:pPr>
               <w:spacing w:before="40" w:after="40"/>
             </w:pPr>
@@ -2294,7 +2294,7 @@
             </w:tcMar>
             <w:vAlign w:val="center"/>
           </w:tcPr>
-          <w:p>
+          <w:p ns2:paraId="707D84FA" ns2:textId="77777777">
             <w:pPr>
               <w:spacing w:before="40" w:after="40"/>
             </w:pPr>
@@ -2320,7 +2320,7 @@
             </w:tcMar>
             <w:vAlign w:val="center"/>
           </w:tcPr>
-          <w:p>
+          <w:p ns2:paraId="1A636A93" ns2:textId="77777777">
             <w:pPr>
               <w:spacing w:before="40" w:after="40"/>
             </w:pPr>
@@ -2331,7 +2331,7 @@
         </w:tc>
       </w:tr>
     </w:tbl>
-    <w:p>
+    <w:p ns2:paraId="55BD671C" ns2:textId="77777777">
       <w:pPr>
         <w:spacing w:after="80"/>
       </w:pPr>
@@ -2357,7 +2357,7 @@
         <w:gridCol w:w="2200"/>
         <w:gridCol w:w="7438"/>
       </w:tblGrid>
-      <w:tr>
+      <w:tr ns2:paraId="664DB77D" ns2:textId="77777777">
         <w:trPr>
           <w:cantSplit/>
           <w:trHeight w:val="900"/>
@@ -2380,7 +2380,7 @@
             </w:tcMar>
             <w:vAlign w:val="center"/>
           </w:tcPr>
-          <w:p>
+          <w:p ns2:paraId="5E298B64" ns2:textId="77777777">
             <w:pPr>
               <w:spacing w:before="40" w:after="40"/>
             </w:pPr>
@@ -2406,7 +2406,7 @@
             </w:tcMar>
             <w:vAlign w:val="center"/>
           </w:tcPr>
-          <w:p>
+          <w:p ns2:paraId="7AD55C95" ns2:textId="77777777">
             <w:pPr>
               <w:spacing w:before="40" w:after="40"/>
             </w:pPr>
@@ -2416,7 +2416,7 @@
           </w:p>
         </w:tc>
       </w:tr>
-      <w:tr>
+      <w:tr ns2:paraId="7F1CD739" ns2:textId="77777777">
         <w:trPr>
           <w:cantSplit/>
           <w:trHeight w:val="900"/>
@@ -2439,7 +2439,7 @@
             </w:tcMar>
             <w:vAlign w:val="center"/>
           </w:tcPr>
-          <w:p>
+          <w:p ns2:paraId="4E851DE3" ns2:textId="77777777">
             <w:pPr>
               <w:spacing w:before="40" w:after="40"/>
             </w:pPr>
@@ -2476,7 +2476,7 @@
         </w:tc>
       </w:tr>
     </w:tbl>
-    <w:p>
+    <w:p ns2:paraId="107991C2" ns2:textId="77777777">
       <w:pPr>
         <w:spacing w:after="80"/>
       </w:pPr>
@@ -2501,7 +2501,7 @@
       <w:tblGrid>
         <w:gridCol w:w="9638"/>
       </w:tblGrid>
-      <w:tr>
+      <w:tr ns2:paraId="0AAE913B" ns2:textId="77777777">
         <w:tc>
           <w:tcPr>
             <w:tcW w:w="9638" w:type="dxa"/>
@@ -2520,7 +2520,7 @@
             </w:tcMar>
             <w:vAlign w:val="center"/>
           </w:tcPr>
-          <w:p>
+          <w:p ns2:paraId="22D9701B" ns2:textId="77777777">
             <w:pPr>
               <w:spacing w:before="40" w:after="40"/>
             </w:pPr>
@@ -2554,7 +2554,7 @@
         </w:tc>
       </w:tr>
     </w:tbl>
-    <w:p>
+    <w:p ns2:paraId="19E37600" ns2:textId="77777777">
       <w:pPr>
         <w:pStyle w:val="Heading1"/>
         <w:spacing w:before="320" w:after="120"/>
@@ -2567,7 +2567,7 @@
         </w:rPr>
       </w:pPr>
     </w:p>
-    <w:p>
+    <w:p ns2:paraId="2053C0D8" ns2:textId="77777777">
       <w:pPr>
         <w:rPr>
           <w:b/>
@@ -2588,7 +2588,7 @@
         <w:br w:type="page"/>
       </w:r>
     </w:p>
-    <w:p>
+    <w:p ns2:paraId="66063A9B" ns2:textId="4632A794">
       <w:pPr>
         <w:pStyle w:val="Heading1"/>
         <w:spacing w:before="320" w:after="120"/>
@@ -2605,7 +2605,7 @@
         <w:t>3. 단계별 평가 (중간 결과 검증)</w:t>
       </w:r>
     </w:p>
-    <w:p>
+    <w:p ns2:paraId="180332AA" ns2:textId="5DB0DEC3">
       <w:pPr>
         <w:spacing w:before="40" w:after="100"/>
         <w:rPr>
@@ -2645,7 +2645,7 @@
         <w:gridCol w:w="1500"/>
         <w:gridCol w:w="3838"/>
       </w:tblGrid>
-      <w:tr>
+      <w:tr ns2:paraId="39EC3C58" ns2:textId="77777777">
         <w:trPr>
           <w:cantSplit/>
           <w:tblHeader/>
@@ -2668,7 +2668,7 @@
             </w:tcMar>
             <w:vAlign w:val="center"/>
           </w:tcPr>
-          <w:p>
+          <w:p ns2:paraId="4DBB5BE1" ns2:textId="77777777">
             <w:pPr>
               <w:spacing w:before="40" w:after="40"/>
             </w:pPr>
@@ -2699,7 +2699,7 @@
             </w:tcMar>
             <w:vAlign w:val="center"/>
           </w:tcPr>
-          <w:p>
+          <w:p ns2:paraId="27C0A274" ns2:textId="77777777">
             <w:pPr>
               <w:spacing w:before="40" w:after="40"/>
             </w:pPr>
@@ -2730,7 +2730,7 @@
             </w:tcMar>
             <w:vAlign w:val="center"/>
           </w:tcPr>
-          <w:p>
+          <w:p ns2:paraId="2424FC35" ns2:textId="77777777">
             <w:pPr>
               <w:spacing w:before="40" w:after="40"/>
             </w:pPr>
@@ -2744,7 +2744,7 @@
           </w:p>
         </w:tc>
       </w:tr>
-      <w:tr>
+      <w:tr ns2:paraId="7205BAA2" ns2:textId="77777777">
         <w:trPr>
           <w:cantSplit/>
           <w:trHeight w:val="800"/>
@@ -2766,69 +2766,69 @@
             </w:tcMar>
             <w:vAlign w:val="center"/>
           </w:tcPr>
+          <w:p ns2:paraId="36D3D390" ns2:textId="77777777">
+            <w:pPr>
+              <w:spacing w:before="40" w:after="40"/>
+            </w:pPr>
+            <w:r>
+              <w:t>3-1. 부실한 중간 결과를 평가 단계가 걸러내는가?</w:t>
+            </w:r>
+          </w:p>
+        </w:tc>
+        <w:tc>
+          <w:tcPr>
+            <w:tcW w:w="1500" w:type="dxa"/>
+            <w:tcBorders>
+              <w:top w:val="single" w:sz="4" w:space="0" w:color="999999"/>
+              <w:left w:val="single" w:sz="4" w:space="0" w:color="999999"/>
+              <w:bottom w:val="single" w:sz="4" w:space="0" w:color="999999"/>
+              <w:right w:val="single" w:sz="4" w:space="0" w:color="999999"/>
+            </w:tcBorders>
+            <w:tcMar>
+              <w:top w:w="60" w:type="dxa"/>
+              <w:left w:w="110" w:type="dxa"/>
+              <w:bottom w:w="60" w:type="dxa"/>
+              <w:right w:w="110" w:type="dxa"/>
+            </w:tcMar>
+            <w:vAlign w:val="center"/>
+          </w:tcPr>
+          <w:p ns2:paraId="7767FBBF" ns2:textId="77777777">
+            <w:pPr>
+              <w:spacing w:before="40" w:after="40"/>
+            </w:pPr>
+            <w:r>
+              <w:t>결함</w:t>
+            </w:r>
+          </w:p>
+        </w:tc>
+        <w:tc>
+          <w:tcPr>
+            <w:tcW w:w="3838" w:type="dxa"/>
+            <w:tcBorders>
+              <w:top w:val="single" w:sz="4" w:space="0" w:color="999999"/>
+              <w:left w:val="single" w:sz="4" w:space="0" w:color="999999"/>
+              <w:bottom w:val="single" w:sz="4" w:space="0" w:color="999999"/>
+              <w:right w:val="single" w:sz="4" w:space="0" w:color="999999"/>
+            </w:tcBorders>
+            <w:tcMar>
+              <w:top w:w="60" w:type="dxa"/>
+              <w:left w:w="110" w:type="dxa"/>
+              <w:bottom w:w="60" w:type="dxa"/>
+              <w:right w:w="110" w:type="dxa"/>
+            </w:tcMar>
+            <w:vAlign w:val="center"/>
+          </w:tcPr>
           <w:p>
             <w:pPr>
               <w:spacing w:before="40" w:after="40"/>
             </w:pPr>
             <w:r>
-              <w:t>3-1. 부실한 중간 결과를 평가 단계가 걸러내는가?</w:t>
-            </w:r>
-          </w:p>
-        </w:tc>
-        <w:tc>
-          <w:tcPr>
-            <w:tcW w:w="1500" w:type="dxa"/>
-            <w:tcBorders>
-              <w:top w:val="single" w:sz="4" w:space="0" w:color="999999"/>
-              <w:left w:val="single" w:sz="4" w:space="0" w:color="999999"/>
-              <w:bottom w:val="single" w:sz="4" w:space="0" w:color="999999"/>
-              <w:right w:val="single" w:sz="4" w:space="0" w:color="999999"/>
-            </w:tcBorders>
-            <w:tcMar>
-              <w:top w:w="60" w:type="dxa"/>
-              <w:left w:w="110" w:type="dxa"/>
-              <w:bottom w:w="60" w:type="dxa"/>
-              <w:right w:w="110" w:type="dxa"/>
-            </w:tcMar>
-            <w:vAlign w:val="center"/>
-          </w:tcPr>
-          <w:p>
-            <w:pPr>
-              <w:spacing w:before="40" w:after="40"/>
-            </w:pPr>
-            <w:r>
-              <w:t>결함</w:t>
-            </w:r>
-          </w:p>
-        </w:tc>
-        <w:tc>
-          <w:tcPr>
-            <w:tcW w:w="3838" w:type="dxa"/>
-            <w:tcBorders>
-              <w:top w:val="single" w:sz="4" w:space="0" w:color="999999"/>
-              <w:left w:val="single" w:sz="4" w:space="0" w:color="999999"/>
-              <w:bottom w:val="single" w:sz="4" w:space="0" w:color="999999"/>
-              <w:right w:val="single" w:sz="4" w:space="0" w:color="999999"/>
-            </w:tcBorders>
-            <w:tcMar>
-              <w:top w:w="60" w:type="dxa"/>
-              <w:left w:w="110" w:type="dxa"/>
-              <w:bottom w:w="60" w:type="dxa"/>
-              <w:right w:w="110" w:type="dxa"/>
-            </w:tcMar>
-            <w:vAlign w:val="center"/>
-          </w:tcPr>
-          <w:p>
-            <w:pPr>
-              <w:spacing w:before="40" w:after="40"/>
-            </w:pPr>
-            <w:r>
               <w:t xml:space="preserve">테스트 모드 3-Q1-1.png/3-Q1-2.png: 근거 없는 일반론 답변이 1회차 “통과 보고서 분량 충족”으로 통과함.</w:t>
             </w:r>
           </w:p>
         </w:tc>
       </w:tr>
-      <w:tr>
+      <w:tr ns2:paraId="7328E627" ns2:textId="77777777">
         <w:trPr>
           <w:cantSplit/>
           <w:trHeight w:val="800"/>
@@ -2850,7 +2850,7 @@
             </w:tcMar>
             <w:vAlign w:val="center"/>
           </w:tcPr>
-          <w:p>
+          <w:p ns2:paraId="60D5C891" ns2:textId="77777777">
             <w:pPr>
               <w:spacing w:before="40" w:after="40"/>
             </w:pPr>
@@ -2876,7 +2876,7 @@
             </w:tcMar>
             <w:vAlign w:val="center"/>
           </w:tcPr>
-          <w:p>
+          <w:p ns2:paraId="047C5C4A" ns2:textId="77777777">
             <w:pPr>
               <w:spacing w:before="40" w:after="40"/>
             </w:pPr>
@@ -2902,7 +2902,7 @@
             </w:tcMar>
             <w:vAlign w:val="center"/>
           </w:tcPr>
-          <w:p>
+          <w:p ns2:paraId="31ED2ECB" ns2:textId="77777777">
             <w:pPr>
               <w:spacing w:before="40" w:after="40"/>
             </w:pPr>
@@ -2912,7 +2912,7 @@
           </w:p>
         </w:tc>
       </w:tr>
-      <w:tr>
+      <w:tr ns2:paraId="0812898F" ns2:textId="77777777">
         <w:trPr>
           <w:cantSplit/>
           <w:trHeight w:val="800"/>
@@ -2934,69 +2934,69 @@
             </w:tcMar>
             <w:vAlign w:val="center"/>
           </w:tcPr>
+          <w:p ns2:paraId="03126028" ns2:textId="77777777">
+            <w:pPr>
+              <w:spacing w:before="40" w:after="40"/>
+            </w:pPr>
+            <w:r>
+              <w:t>3-3. 재시도 시 이전 평가 내용이 다음 시도에 전달되는가?</w:t>
+            </w:r>
+          </w:p>
+        </w:tc>
+        <w:tc>
+          <w:tcPr>
+            <w:tcW w:w="1500" w:type="dxa"/>
+            <w:tcBorders>
+              <w:top w:val="single" w:sz="4" w:space="0" w:color="999999"/>
+              <w:left w:val="single" w:sz="4" w:space="0" w:color="999999"/>
+              <w:bottom w:val="single" w:sz="4" w:space="0" w:color="999999"/>
+              <w:right w:val="single" w:sz="4" w:space="0" w:color="999999"/>
+            </w:tcBorders>
+            <w:tcMar>
+              <w:top w:w="60" w:type="dxa"/>
+              <w:left w:w="110" w:type="dxa"/>
+              <w:bottom w:w="60" w:type="dxa"/>
+              <w:right w:w="110" w:type="dxa"/>
+            </w:tcMar>
+            <w:vAlign w:val="center"/>
+          </w:tcPr>
+          <w:p ns2:paraId="72FF86EA" ns2:textId="77777777">
+            <w:pPr>
+              <w:spacing w:before="40" w:after="40"/>
+            </w:pPr>
+            <w:r>
+              <w:t>결함 (실패 재시도 미발생)</w:t>
+            </w:r>
+          </w:p>
+        </w:tc>
+        <w:tc>
+          <w:tcPr>
+            <w:tcW w:w="3838" w:type="dxa"/>
+            <w:tcBorders>
+              <w:top w:val="single" w:sz="4" w:space="0" w:color="999999"/>
+              <w:left w:val="single" w:sz="4" w:space="0" w:color="999999"/>
+              <w:bottom w:val="single" w:sz="4" w:space="0" w:color="999999"/>
+              <w:right w:val="single" w:sz="4" w:space="0" w:color="999999"/>
+            </w:tcBorders>
+            <w:tcMar>
+              <w:top w:w="60" w:type="dxa"/>
+              <w:left w:w="110" w:type="dxa"/>
+              <w:bottom w:w="60" w:type="dxa"/>
+              <w:right w:w="110" w:type="dxa"/>
+            </w:tcMar>
+            <w:vAlign w:val="center"/>
+          </w:tcPr>
           <w:p>
             <w:pPr>
               <w:spacing w:before="40" w:after="40"/>
             </w:pPr>
             <w:r>
-              <w:t>3-3. 재시도 시 이전 평가 내용이 다음 시도에 전달되는가?</w:t>
-            </w:r>
-          </w:p>
-        </w:tc>
-        <w:tc>
-          <w:tcPr>
-            <w:tcW w:w="1500" w:type="dxa"/>
-            <w:tcBorders>
-              <w:top w:val="single" w:sz="4" w:space="0" w:color="999999"/>
-              <w:left w:val="single" w:sz="4" w:space="0" w:color="999999"/>
-              <w:bottom w:val="single" w:sz="4" w:space="0" w:color="999999"/>
-              <w:right w:val="single" w:sz="4" w:space="0" w:color="999999"/>
-            </w:tcBorders>
-            <w:tcMar>
-              <w:top w:w="60" w:type="dxa"/>
-              <w:left w:w="110" w:type="dxa"/>
-              <w:bottom w:w="60" w:type="dxa"/>
-              <w:right w:w="110" w:type="dxa"/>
-            </w:tcMar>
-            <w:vAlign w:val="center"/>
-          </w:tcPr>
-          <w:p>
-            <w:pPr>
-              <w:spacing w:before="40" w:after="40"/>
-            </w:pPr>
-            <w:r>
-              <w:t>결함 (실패 재시도 미발생)</w:t>
-            </w:r>
-          </w:p>
-        </w:tc>
-        <w:tc>
-          <w:tcPr>
-            <w:tcW w:w="3838" w:type="dxa"/>
-            <w:tcBorders>
-              <w:top w:val="single" w:sz="4" w:space="0" w:color="999999"/>
-              <w:left w:val="single" w:sz="4" w:space="0" w:color="999999"/>
-              <w:bottom w:val="single" w:sz="4" w:space="0" w:color="999999"/>
-              <w:right w:val="single" w:sz="4" w:space="0" w:color="999999"/>
-            </w:tcBorders>
-            <w:tcMar>
-              <w:top w:w="60" w:type="dxa"/>
-              <w:left w:w="110" w:type="dxa"/>
-              <w:bottom w:w="60" w:type="dxa"/>
-              <w:right w:w="110" w:type="dxa"/>
-            </w:tcMar>
-            <w:vAlign w:val="center"/>
-          </w:tcPr>
-          <w:p>
-            <w:pPr>
-              <w:spacing w:before="40" w:after="40"/>
-            </w:pPr>
-            <w:r>
               <w:t xml:space="preserve">이번 테스트는 1회차 통과해 재시도 미발생. 코드상 writer 입력에는 eval_reason 포함하지 않음.</w:t>
             </w:r>
           </w:p>
         </w:tc>
       </w:tr>
-      <w:tr>
+      <w:tr ns2:paraId="44B6427E" ns2:textId="77777777">
         <w:trPr>
           <w:cantSplit/>
           <w:trHeight w:val="800"/>
@@ -3018,7 +3018,7 @@
             </w:tcMar>
             <w:vAlign w:val="center"/>
           </w:tcPr>
-          <w:p>
+          <w:p ns2:paraId="4A33E00E" ns2:textId="77777777">
             <w:pPr>
               <w:spacing w:before="40" w:after="40"/>
             </w:pPr>
@@ -3044,7 +3044,7 @@
             </w:tcMar>
             <w:vAlign w:val="center"/>
           </w:tcPr>
-          <w:p>
+          <w:p ns2:paraId="43276043" ns2:textId="77777777">
             <w:pPr>
               <w:spacing w:before="40" w:after="40"/>
             </w:pPr>
@@ -3070,7 +3070,7 @@
             </w:tcMar>
             <w:vAlign w:val="center"/>
           </w:tcPr>
-          <w:p>
+          <w:p ns2:paraId="58A4C8C0" ns2:textId="77777777">
             <w:pPr>
               <w:spacing w:before="40" w:after="40"/>
             </w:pPr>
@@ -3081,7 +3081,7 @@
         </w:tc>
       </w:tr>
     </w:tbl>
-    <w:p>
+    <w:p ns2:paraId="1F21C653" ns2:textId="77777777">
       <w:pPr>
         <w:spacing w:after="80"/>
       </w:pPr>
@@ -3107,7 +3107,7 @@
         <w:gridCol w:w="2200"/>
         <w:gridCol w:w="7438"/>
       </w:tblGrid>
-      <w:tr>
+      <w:tr ns2:paraId="33994CE2" ns2:textId="77777777">
         <w:trPr>
           <w:cantSplit/>
           <w:trHeight w:val="900"/>
@@ -3130,7 +3130,7 @@
             </w:tcMar>
             <w:vAlign w:val="center"/>
           </w:tcPr>
-          <w:p>
+          <w:p ns2:paraId="6DC21CDD" ns2:textId="77777777">
             <w:pPr>
               <w:spacing w:before="40" w:after="40"/>
             </w:pPr>
@@ -3156,7 +3156,7 @@
             </w:tcMar>
             <w:vAlign w:val="center"/>
           </w:tcPr>
-          <w:p>
+          <w:p ns2:paraId="4ADA4BC3" ns2:textId="77777777">
             <w:pPr>
               <w:spacing w:before="40" w:after="40"/>
             </w:pPr>
@@ -3166,7 +3166,7 @@
           </w:p>
         </w:tc>
       </w:tr>
-      <w:tr>
+      <w:tr ns2:paraId="4751B705" ns2:textId="77777777">
         <w:trPr>
           <w:cantSplit/>
           <w:trHeight w:val="900"/>
@@ -3189,7 +3189,7 @@
             </w:tcMar>
             <w:vAlign w:val="center"/>
           </w:tcPr>
-          <w:p>
+          <w:p ns2:paraId="1B275A2A" ns2:textId="77777777">
             <w:pPr>
               <w:spacing w:before="40" w:after="40"/>
             </w:pPr>
@@ -3226,12 +3226,12 @@
         </w:tc>
       </w:tr>
     </w:tbl>
-    <w:p>
+    <w:p ns2:paraId="24E72824" ns2:textId="77777777">
       <w:pPr>
         <w:spacing w:after="80"/>
       </w:pPr>
     </w:p>
-    <w:p>
+    <w:p ns2:paraId="48EE73F0" ns2:textId="77777777">
       <w:pPr>
         <w:spacing w:before="40" w:after="100"/>
       </w:pPr>
@@ -3240,6 +3240,53 @@
           <w:rFonts w:hint="eastAsia"/>
         </w:rPr>
         <w:t xml:space="preserve">제출 자료 : </w:t>
+      </w:r>
+    </w:p>
+    <w:p ns2:paraId="7EE29DF1" ns2:textId="77777777">
+      <w:pPr>
+        <w:pStyle w:val="ListParagraph"/>
+        <w:numPr>
+          <w:ilvl w:val="0"/>
+          <w:numId w:val="3"/>
+        </w:numPr>
+        <w:spacing w:before="40" w:after="100"/>
+      </w:pPr>
+      <w:r>
+        <w:rPr>
+          <w:rFonts w:hint="eastAsia"/>
+        </w:rPr>
+        <w:t>질문별 오른쪽 패널 캡쳐 (실행 경로, 시간, 평가 판정의 근거)</w:t>
+      </w:r>
+    </w:p>
+    <w:p ns2:paraId="56D22BFF" ns2:textId="08C61D75">
+      <w:pPr>
+        <w:pStyle w:val="ListParagraph"/>
+        <w:numPr>
+          <w:ilvl w:val="0"/>
+          <w:numId w:val="3"/>
+        </w:numPr>
+        <w:spacing w:before="40" w:after="100"/>
+      </w:pPr>
+      <w:r>
+        <w:rPr>
+          <w:rFonts w:hint="eastAsia"/>
+        </w:rPr>
+        <w:t xml:space="preserve">파일명 : </w:t>
+      </w:r>
+      <w:r>
+        <w:t>3</w:t>
+      </w:r>
+      <w:r>
+        <w:rPr>
+          <w:rFonts w:hint="eastAsia"/>
+        </w:rPr>
+        <w:t>-</w:t>
+      </w:r>
+      <w:r>
+        <w:rPr>
+          <w:lang w:val="en-US"/>
+        </w:rPr>
+        <w:t xml:space="preserve">Q1.png </w:t>
       </w:r>
     </w:p>
     <w:p>
@@ -3254,53 +3301,6 @@
       <w:r>
         <w:rPr>
           <w:rFonts w:hint="eastAsia"/>
-        </w:rPr>
-        <w:t>질문별 오른쪽 패널 캡쳐 (실행 경로, 시간, 평가 판정의 근거)</w:t>
-      </w:r>
-    </w:p>
-    <w:p>
-      <w:pPr>
-        <w:pStyle w:val="ListParagraph"/>
-        <w:numPr>
-          <w:ilvl w:val="0"/>
-          <w:numId w:val="3"/>
-        </w:numPr>
-        <w:spacing w:before="40" w:after="100"/>
-      </w:pPr>
-      <w:r>
-        <w:rPr>
-          <w:rFonts w:hint="eastAsia"/>
-        </w:rPr>
-        <w:t xml:space="preserve">파일명 : </w:t>
-      </w:r>
-      <w:r>
-        <w:t>3</w:t>
-      </w:r>
-      <w:r>
-        <w:rPr>
-          <w:rFonts w:hint="eastAsia"/>
-        </w:rPr>
-        <w:t>-</w:t>
-      </w:r>
-      <w:r>
-        <w:rPr>
-          <w:lang w:val="en-US"/>
-        </w:rPr>
-        <w:t xml:space="preserve">Q1.png </w:t>
-      </w:r>
-    </w:p>
-    <w:p>
-      <w:pPr>
-        <w:pStyle w:val="ListParagraph"/>
-        <w:numPr>
-          <w:ilvl w:val="0"/>
-          <w:numId w:val="3"/>
-        </w:numPr>
-        <w:spacing w:before="40" w:after="100"/>
-      </w:pPr>
-      <w:r>
-        <w:rPr>
-          <w:rFonts w:hint="eastAsia"/>
           <w:lang w:val="en-US"/>
         </w:rPr>
         <w:t xml:space="preserve">패널 외 코드, 로그</w:t>
@@ -3355,7 +3355,7 @@
         <w:br w:type="page"/>
       </w:r>
     </w:p>
-    <w:p>
+    <w:p ns2:paraId="56CD5799" ns2:textId="47BD5727">
       <w:pPr>
         <w:pStyle w:val="Heading1"/>
         <w:spacing w:before="320" w:after="120"/>
@@ -3392,7 +3392,7 @@
       <w:tblGrid>
         <w:gridCol w:w="9638"/>
       </w:tblGrid>
-      <w:tr>
+      <w:tr ns2:paraId="74816835" ns2:textId="77777777">
         <w:trPr>
           <w:cantSplit/>
         </w:trPr>
@@ -3414,7 +3414,7 @@
             </w:tcMar>
             <w:vAlign w:val="center"/>
           </w:tcPr>
-          <w:p>
+          <w:p ns2:paraId="1EA67FCC" ns2:textId="093ADE58">
             <w:pPr>
               <w:spacing w:before="40" w:after="40"/>
               <w:rPr>
@@ -3433,7 +3433,7 @@
           </w:p>
         </w:tc>
       </w:tr>
-      <w:tr>
+      <w:tr ns2:paraId="28305745" ns2:textId="77777777">
         <w:trPr>
           <w:cantSplit/>
           <w:trHeight w:val="1700"/>
@@ -3466,7 +3466,7 @@
         </w:tc>
       </w:tr>
     </w:tbl>
-    <w:p>
+    <w:p ns2:paraId="6190C563" ns2:textId="77777777">
       <w:pPr>
         <w:spacing w:after="80"/>
       </w:pPr>
@@ -3491,7 +3491,7 @@
       <w:tblGrid>
         <w:gridCol w:w="9638"/>
       </w:tblGrid>
-      <w:tr>
+      <w:tr ns2:paraId="0738F18C" ns2:textId="77777777">
         <w:trPr>
           <w:cantSplit/>
         </w:trPr>
@@ -3513,7 +3513,7 @@
             </w:tcMar>
             <w:vAlign w:val="center"/>
           </w:tcPr>
-          <w:p>
+          <w:p ns2:paraId="09F14035" ns2:textId="77777777">
             <w:pPr>
               <w:spacing w:before="40" w:after="40"/>
             </w:pPr>
@@ -3529,7 +3529,7 @@
           </w:p>
         </w:tc>
       </w:tr>
-      <w:tr>
+      <w:tr ns2:paraId="79EBEE00" ns2:textId="77777777">
         <w:trPr>
           <w:cantSplit/>
           <w:trHeight w:val="1700"/>
@@ -3559,10 +3559,15 @@
               <w:t xml:space="preserve">Tavily 검색 결과의 사실 정확성과 TRL 판단은 외부 자료와 별도 대조하지 않음. 테스트 모드에서 재시도는 발생하지 않아 재시도 동작은 코드 기준으로 확인함. LangSmith trace(run_id 94beb1fd384f)에서 competitor_analyst의 LLM 호출 3회 후 writer 입력 competitor_findings가 Samsung 1건뿐임을 확인함. 원인은 backend/app/agent/nodes.py 90행의 결과 덮어쓰기임. 캡처: evidence/3-Q2-LangSmith-Trace.png.</w:t>
             </w:r>
           </w:p>
+          <w:p>
+            <w:r>
+              <w:t>추가 코드 점검: analyze_competitor()는 기업별 sources를 반환하지만, backend/app/agent/prompts.py의 format_findings()는 competitor와 analysis만 writer 입력에 포함하고 sources는 전달하지 않음. 따라서 분석 문장에 붙은 [n]이 어느 기업별 자료를 가리키는지 writer 단계에서 검증하기 어려움. 코드 정적 확인이며 실제 인용 오류 발생 여부는 별도 확인하지 않음.</w:t>
+            </w:r>
+          </w:p>
         </w:tc>
       </w:tr>
     </w:tbl>
-    <w:p/>
+    <w:p ns2:paraId="6B165DEC" ns2:textId="77777777"/>
     <w:p>
       <w:r>
         <w:t>실행값 (세부 캡처는 /evidence 폴더)</w:t>

</xml_diff>